<commit_message>
Add estimating skill; fix quote acceptance client fields and markup labels
estimating: estimate_price computation (matches the estimate workbook to
the cent), an estimating and quoting page, and estimate and quote
acceptance examples.

Quote Acceptance Form printed the builder's phone and email as the
client's; it now uses [CLIENT_PHONE] and [CLIENT_EMAIL]. The estimate
workbook, quote converter and sensitivity calculator calculate markup on
cost but called it margin; they are relabelled and the sensitivity sheet
gains a margin-on-price column. The fill tool may now override simple
default-value formulas such as labour rates.

Co-Authored-By: Claude Opus 5.5 <noreply@anthropic.com>
</commit_message>
<xml_diff>
--- a/templates/word/Quote_Acceptance_Form_TEMPLATE.docx
+++ b/templates/word/Quote_Acceptance_Form_TEMPLATE.docx
@@ -540,7 +540,7 @@
                 <w:rFonts w:ascii="Arial" w:hAnsi="Arial"/>
                 <w:sz w:val="20"/>
               </w:rPr>
-              <w:t>[PHONE]</w:t>
+              <w:t>[CLIENT_PHONE]</w:t>
             </w:r>
           </w:p>
         </w:tc>
@@ -584,7 +584,7 @@
                 <w:rFonts w:ascii="Arial" w:hAnsi="Arial"/>
                 <w:sz w:val="20"/>
               </w:rPr>
-              <w:t>[EMAIL]</w:t>
+              <w:t>[CLIENT_EMAIL]</w:t>
             </w:r>
           </w:p>
         </w:tc>

</xml_diff>